<commit_message>
Show section titles only where each section starts
Continuation pages drop the repeated title and give its space to the columns.

Co-Authored-By: Claude Opus 5.5 <noreply@anthropic.com>
Claude-Session: https://claude.ai/code/session_0188QZHBkA8n5QL7BtmFakQg
</commit_message>
<xml_diff>
--- a/informe/Mallplaza_CFA_Report_template.docx
+++ b/informe/Mallplaza_CFA_Report_template.docx
@@ -2153,22 +2153,8 @@
     <w:p>
       <w:pPr>
         <w:pageBreakBefore/>
-        <w:pBdr>
-          <w:bottom w:val="single" w:color="14284B" w:sz="18" w:space="2"/>
-        </w:pBdr>
-        <w:spacing w:after="80"/>
+        <w:spacing w:after="0" w:before="0" w:line="20" w:lineRule="exact"/>
       </w:pPr>
-      <w:r>
-        <w:rPr>
-          <w:rFonts w:ascii="Arial" w:cs="Arial" w:eastAsia="Arial" w:hAnsi="Arial"/>
-          <w:b/>
-          <w:bCs/>
-          <w:color w:val="14284B"/>
-          <w:sz w:val="30"/>
-          <w:szCs w:val="30"/>
-        </w:rPr>
-        <w:t xml:space="preserve">INDUSTRY OVERVIEW AND COMPETITIVE POSITIONING</w:t>
-      </w:r>
     </w:p>
     <w:tbl>
       <w:tblPr>
@@ -2189,7 +2175,7 @@
       </w:tblGrid>
       <w:tr>
         <w:trPr>
-          <w:trHeight w:val="14100" w:hRule="atLeast"/>
+          <w:trHeight w:val="14560" w:hRule="atLeast"/>
         </w:trPr>
         <w:tc>
           <w:tcPr>
@@ -4406,22 +4392,8 @@
     <w:p>
       <w:pPr>
         <w:pageBreakBefore/>
-        <w:pBdr>
-          <w:bottom w:val="single" w:color="14284B" w:sz="18" w:space="2"/>
-        </w:pBdr>
-        <w:spacing w:after="80"/>
+        <w:spacing w:after="0" w:before="0" w:line="20" w:lineRule="exact"/>
       </w:pPr>
-      <w:r>
-        <w:rPr>
-          <w:rFonts w:ascii="Arial" w:cs="Arial" w:eastAsia="Arial" w:hAnsi="Arial"/>
-          <w:b/>
-          <w:bCs/>
-          <w:color w:val="14284B"/>
-          <w:sz w:val="30"/>
-          <w:szCs w:val="30"/>
-        </w:rPr>
-        <w:t xml:space="preserve">FINANCIAL ANALYSIS</w:t>
-      </w:r>
     </w:p>
     <w:tbl>
       <w:tblPr>
@@ -4442,7 +4414,7 @@
       </w:tblGrid>
       <w:tr>
         <w:trPr>
-          <w:trHeight w:val="14100" w:hRule="atLeast"/>
+          <w:trHeight w:val="14560" w:hRule="atLeast"/>
         </w:trPr>
         <w:tc>
           <w:tcPr>
@@ -5758,22 +5730,8 @@
     <w:p>
       <w:pPr>
         <w:pageBreakBefore/>
-        <w:pBdr>
-          <w:bottom w:val="single" w:color="14284B" w:sz="18" w:space="2"/>
-        </w:pBdr>
-        <w:spacing w:after="80"/>
+        <w:spacing w:after="0" w:before="0" w:line="20" w:lineRule="exact"/>
       </w:pPr>
-      <w:r>
-        <w:rPr>
-          <w:rFonts w:ascii="Arial" w:cs="Arial" w:eastAsia="Arial" w:hAnsi="Arial"/>
-          <w:b/>
-          <w:bCs/>
-          <w:color w:val="14284B"/>
-          <w:sz w:val="30"/>
-          <w:szCs w:val="30"/>
-        </w:rPr>
-        <w:t xml:space="preserve">VALUATION</w:t>
-      </w:r>
     </w:p>
     <w:tbl>
       <w:tblPr>
@@ -5794,7 +5752,7 @@
       </w:tblGrid>
       <w:tr>
         <w:trPr>
-          <w:trHeight w:val="14100" w:hRule="atLeast"/>
+          <w:trHeight w:val="14560" w:hRule="atLeast"/>
         </w:trPr>
         <w:tc>
           <w:tcPr>

</xml_diff>